<commit_message>
La descripción dice «ítem» donde decía «caso»
En la organización que la va a leer, «caso» es un tratamiento, así que
«una lista de casos» se entendía como otra cosa. El glosario del núcleo
cambió a «Ítem» (core 5adf147) y éste lo sigue para que los dos documentos
usen la misma palabra. «Registro» tampoco servía: ya nombra lo que queda
anotado de cada corrida.
</commit_message>
<xml_diff>
--- a/docs/descripcion/que-es-workflow-bot-app.docx
+++ b/docs/descripcion/que-es-workflow-bot-app.docx
@@ -158,7 +158,7 @@
         <w:t xml:space="preserve"> </w:t>
       </w:r>
       <w:r>
-        <w:t xml:space="preserve">corrida, caso, paso, complemento, herramienta, actor, traza, bitácora,</w:t>
+        <w:t xml:space="preserve">corrida, ítem, paso, complemento, herramienta, actor, traza, bitácora,</w:t>
       </w:r>
       <w:r>
         <w:t xml:space="preserve"> </w:t>
@@ -302,7 +302,7 @@
         <w:t xml:space="preserve">bot-core</w:t>
       </w:r>
       <w:r>
-        <w:t xml:space="preserve">: muestra una lista de casos traída de otro sistema y deja</w:t>
+        <w:t xml:space="preserve">: muestra una lista de ítems traída de otro sistema y deja</w:t>
       </w:r>
       <w:r>
         <w:t xml:space="preserve"> </w:t>
@@ -609,7 +609,7 @@
           <w:bCs/>
           <w:b/>
         </w:rPr>
-        <w:t xml:space="preserve">caso</w:t>
+        <w:t xml:space="preserve">ítem</w:t>
       </w:r>
       <w:r>
         <w:t xml:space="preserve">.</w:t>
@@ -634,7 +634,7 @@
         <w:t xml:space="preserve"> </w:t>
       </w:r>
       <w:r>
-        <w:t xml:space="preserve">Esa lista se muestra como una tabla, una fila por caso, con</w:t>
+        <w:t xml:space="preserve">Esa lista se muestra como una tabla, una fila por ítem, con</w:t>
       </w:r>
       <w:r>
         <w:t xml:space="preserve"> </w:t>
@@ -702,7 +702,7 @@
         <w:t xml:space="preserve"> </w:t>
       </w:r>
       <w:r>
-        <w:t xml:space="preserve">del caso. Desde la grilla se ve, fila por fila, cómo terminó cada una.</w:t>
+        <w:t xml:space="preserve">del ítem. Desde la grilla se ve, fila por fila, cómo terminó cada una.</w:t>
       </w:r>
     </w:p>
     <w:p>
@@ -1047,13 +1047,13 @@
       </w:r>
     </w:p>
     <w:bookmarkEnd w:id="33"/>
-    <w:bookmarkStart w:id="45" w:name="sources-la-grilla-de-casos"/>
+    <w:bookmarkStart w:id="45" w:name="sources-la-grilla-de-ítems"/>
     <w:p>
       <w:pPr>
         <w:pStyle w:val="Heading3"/>
       </w:pPr>
       <w:r>
-        <w:t xml:space="preserve">4.2 Sources: la grilla de casos</w:t>
+        <w:t xml:space="preserve">4.2 Sources: la grilla de ítems</w:t>
       </w:r>
     </w:p>
     <w:p>
@@ -1258,7 +1258,7 @@
         <w:t xml:space="preserve"> </w:t>
       </w:r>
       <w:r>
-        <w:t xml:space="preserve">abre la bitácora del caso.</w:t>
+        <w:t xml:space="preserve">abre la bitácora del ítem.</w:t>
       </w:r>
     </w:p>
     <w:p>
@@ -1515,13 +1515,13 @@
       </w:r>
     </w:p>
     <w:bookmarkEnd w:id="40"/>
-    <w:bookmarkStart w:id="44" w:name="la-bitácora-de-un-caso"/>
+    <w:bookmarkStart w:id="44" w:name="la-bitácora-de-un-ítem"/>
     <w:p>
       <w:pPr>
         <w:pStyle w:val="Heading4"/>
       </w:pPr>
       <w:r>
-        <w:t xml:space="preserve">La bitácora de un caso</w:t>
+        <w:t xml:space="preserve">La bitácora de un ítem</w:t>
       </w:r>
     </w:p>
     <w:p>
@@ -1563,7 +1563,7 @@
           <wp:inline>
             <wp:extent cx="5334000" cy="3333750"/>
             <wp:effectExtent b="0" l="0" r="0" t="0"/>
-            <wp:docPr descr="La bitácora de un caso: cada línea, con hora y paso" title="" id="42" name="Picture"/>
+            <wp:docPr descr="La bitácora de un ítem: cada línea, con hora y paso" title="" id="42" name="Picture"/>
             <a:graphic>
               <a:graphicData uri="http://schemas.openxmlformats.org/drawingml/2006/picture">
                 <pic:pic>
@@ -1606,7 +1606,7 @@
         <w:pStyle w:val="ImageCaption"/>
       </w:pPr>
       <w:r>
-        <w:t xml:space="preserve">La bitácora de un caso: cada línea, con hora y paso</w:t>
+        <w:t xml:space="preserve">La bitácora de un ítem: cada línea, con hora y paso</w:t>
       </w:r>
     </w:p>
     <w:p>
@@ -3751,7 +3751,7 @@
         <w:pStyle w:val="Compact"/>
       </w:pPr>
       <w:r>
-        <w:t xml:space="preserve">No contiene reglas de negocio. Qué se hace con cada caso lo definen los</w:t>
+        <w:t xml:space="preserve">No contiene reglas de negocio. Qué se hace con cada ítem lo definen los</w:t>
       </w:r>
       <w:r>
         <w:t xml:space="preserve"> </w:t>
@@ -3829,7 +3829,7 @@
         <w:pStyle w:val="FirstParagraph"/>
       </w:pPr>
       <w:r>
-        <w:t xml:space="preserve">Los términos del motor (flujo, corrida, caso, paso, complemento, herramienta,</w:t>
+        <w:t xml:space="preserve">Los términos del motor (flujo, corrida, ítem, paso, complemento, herramienta,</w:t>
       </w:r>
       <w:r>
         <w:t xml:space="preserve"> </w:t>
@@ -3949,7 +3949,7 @@
               <w:jc w:val="left"/>
             </w:pPr>
             <w:r>
-              <w:t xml:space="preserve">La conexión a otro sistema de donde sale la lista de casos.</w:t>
+              <w:t xml:space="preserve">La conexión a otro sistema de donde sale la lista de ítems.</w:t>
             </w:r>
           </w:p>
         </w:tc>
@@ -3975,7 +3975,7 @@
               <w:jc w:val="left"/>
             </w:pPr>
             <w:r>
-              <w:t xml:space="preserve">La tabla que muestra los casos de una fuente, una fila por caso.</w:t>
+              <w:t xml:space="preserve">La tabla que muestra los ítems de una fuente, una fila por ítem.</w:t>
             </w:r>
           </w:p>
         </w:tc>
@@ -4105,7 +4105,7 @@
               <w:jc w:val="left"/>
             </w:pPr>
             <w:r>
-              <w:t xml:space="preserve">La bitácora de un caso, como se ve en la pantalla.</w:t>
+              <w:t xml:space="preserve">La bitácora de un ítem, como se ve en la pantalla.</w:t>
             </w:r>
           </w:p>
         </w:tc>

</xml_diff>